<commit_message>
docs: add screenshots and embed in report
- 16 automated screenshots: UI views, API terminal outputs, test results, git history
- Updated report with embedded images replacing placeholders
- Added .vite/ to gitignore
</commit_message>
<xml_diff>
--- a/docs/IT3030_PAF_Report.docx
+++ b/docs/IT3030_PAF_Report.docx
@@ -4255,15 +4255,23 @@
     </w:p>
     <w:p>
       <w:r>
-        <w:t>Note: Screenshots should be captured from the running application and inserted below. The following placeholders indicate what each screenshot should show.</w:t>
+        <w:t>This section presents captured screenshots from the running application, API testing terminal outputs, automated test results, and version control evidence.</w:t>
       </w:r>
     </w:p>
     <w:p>
       <w:pPr>
+        <w:pStyle w:val="Heading2"/>
+      </w:pPr>
+      <w:r>
+        <w:t>8.1 User Interface</w:t>
+      </w:r>
+    </w:p>
+    <w:p>
+      <w:pPr>
         <w:pStyle w:val="Heading3"/>
       </w:pPr>
       <w:r>
-        <w:t>Screenshot 1: User Dashboard – Booking Form</w:t>
+        <w:t>User Dashboard – Booking Form</w:t>
       </w:r>
     </w:p>
     <w:p>
@@ -4276,26 +4284,64 @@
         <w:jc w:val="center"/>
       </w:pPr>
       <w:r>
+        <w:drawing>
+          <wp:inline xmlns:a="http://schemas.openxmlformats.org/drawingml/2006/main" xmlns:pic="http://schemas.openxmlformats.org/drawingml/2006/picture">
+            <wp:extent cx="5486400" cy="3526971"/>
+            <wp:docPr id="1" name="Picture 1"/>
+            <wp:cNvGraphicFramePr>
+              <a:graphicFrameLocks noChangeAspect="1"/>
+            </wp:cNvGraphicFramePr>
+            <a:graphic>
+              <a:graphicData uri="http://schemas.openxmlformats.org/drawingml/2006/picture">
+                <pic:pic>
+                  <pic:nvPicPr>
+                    <pic:cNvPr id="0" name="01_user_dashboard_form.png"/>
+                    <pic:cNvPicPr/>
+                  </pic:nvPicPr>
+                  <pic:blipFill>
+                    <a:blip r:embed="rId9"/>
+                    <a:stretch>
+                      <a:fillRect/>
+                    </a:stretch>
+                  </pic:blipFill>
+                  <pic:spPr>
+                    <a:xfrm>
+                      <a:off x="0" y="0"/>
+                      <a:ext cx="5486400" cy="3526971"/>
+                    </a:xfrm>
+                    <a:prstGeom prst="rect"/>
+                  </pic:spPr>
+                </pic:pic>
+              </a:graphicData>
+            </a:graphic>
+          </wp:inline>
+        </w:drawing>
+      </w:r>
+    </w:p>
+    <w:p>
+      <w:pPr>
+        <w:jc w:val="center"/>
+      </w:pPr>
+      <w:r>
         <w:rPr>
           <w:i/>
-          <w:color w:val="969696"/>
-          <w:sz w:val="28"/>
+          <w:color w:val="646464"/>
+          <w:sz w:val="18"/>
         </w:rPr>
-        <w:t>[  INSERT SCREENSHOT HERE  ]</w:t>
+        <w:t>Figure 8.1: User Dashboard – Empty Booking Form</w:t>
       </w:r>
     </w:p>
-    <w:p/>
     <w:p>
       <w:pPr>
         <w:pStyle w:val="Heading3"/>
       </w:pPr>
       <w:r>
-        <w:t>Screenshot 2: User Dashboard – Booking Cards</w:t>
+        <w:t>User Dashboard – Filled Booking Form</w:t>
       </w:r>
     </w:p>
     <w:p>
       <w:r>
-        <w:t>Displays booked resources as cards with status badges (PENDING in yellow, APPROVED in green). Cancel button visible on PENDING/APPROVED bookings.</w:t>
+        <w:t>Demonstrates the form filled with booking details before submission.</w:t>
       </w:r>
     </w:p>
     <w:p>
@@ -4303,26 +4349,64 @@
         <w:jc w:val="center"/>
       </w:pPr>
       <w:r>
+        <w:drawing>
+          <wp:inline xmlns:a="http://schemas.openxmlformats.org/drawingml/2006/main" xmlns:pic="http://schemas.openxmlformats.org/drawingml/2006/picture">
+            <wp:extent cx="5486400" cy="3526971"/>
+            <wp:docPr id="2" name="Picture 2"/>
+            <wp:cNvGraphicFramePr>
+              <a:graphicFrameLocks noChangeAspect="1"/>
+            </wp:cNvGraphicFramePr>
+            <a:graphic>
+              <a:graphicData uri="http://schemas.openxmlformats.org/drawingml/2006/picture">
+                <pic:pic>
+                  <pic:nvPicPr>
+                    <pic:cNvPr id="0" name="02_filled_booking_form.png"/>
+                    <pic:cNvPicPr/>
+                  </pic:nvPicPr>
+                  <pic:blipFill>
+                    <a:blip r:embed="rId10"/>
+                    <a:stretch>
+                      <a:fillRect/>
+                    </a:stretch>
+                  </pic:blipFill>
+                  <pic:spPr>
+                    <a:xfrm>
+                      <a:off x="0" y="0"/>
+                      <a:ext cx="5486400" cy="3526971"/>
+                    </a:xfrm>
+                    <a:prstGeom prst="rect"/>
+                  </pic:spPr>
+                </pic:pic>
+              </a:graphicData>
+            </a:graphic>
+          </wp:inline>
+        </w:drawing>
+      </w:r>
+    </w:p>
+    <w:p>
+      <w:pPr>
+        <w:jc w:val="center"/>
+      </w:pPr>
+      <w:r>
         <w:rPr>
           <w:i/>
-          <w:color w:val="969696"/>
-          <w:sz w:val="28"/>
+          <w:color w:val="646464"/>
+          <w:sz w:val="18"/>
         </w:rPr>
-        <w:t>[  INSERT SCREENSHOT HERE  ]</w:t>
+        <w:t>Figure 8.2: User Dashboard – Filled Booking Form</w:t>
       </w:r>
     </w:p>
-    <w:p/>
     <w:p>
       <w:pPr>
         <w:pStyle w:val="Heading3"/>
       </w:pPr>
       <w:r>
-        <w:t>Screenshot 3: Admin Dashboard – All Bookings</w:t>
+        <w:t>User Dashboard – Booking Cards (Pending)</w:t>
       </w:r>
     </w:p>
     <w:p>
       <w:r>
-        <w:t>Shows the Admin view listing all bookings across the campus. Each pending booking shows Approve (green) and Reject (red) buttons.</w:t>
+        <w:t>Displays booked resources as cards with PENDING status badges (yellow). Cancel button is visible on each booking card.</w:t>
       </w:r>
     </w:p>
     <w:p>
@@ -4330,26 +4414,64 @@
         <w:jc w:val="center"/>
       </w:pPr>
       <w:r>
+        <w:drawing>
+          <wp:inline xmlns:a="http://schemas.openxmlformats.org/drawingml/2006/main" xmlns:pic="http://schemas.openxmlformats.org/drawingml/2006/picture">
+            <wp:extent cx="5486400" cy="3766022"/>
+            <wp:docPr id="3" name="Picture 3"/>
+            <wp:cNvGraphicFramePr>
+              <a:graphicFrameLocks noChangeAspect="1"/>
+            </wp:cNvGraphicFramePr>
+            <a:graphic>
+              <a:graphicData uri="http://schemas.openxmlformats.org/drawingml/2006/picture">
+                <pic:pic>
+                  <pic:nvPicPr>
+                    <pic:cNvPr id="0" name="03_user_bookings_pending.png"/>
+                    <pic:cNvPicPr/>
+                  </pic:nvPicPr>
+                  <pic:blipFill>
+                    <a:blip r:embed="rId11"/>
+                    <a:stretch>
+                      <a:fillRect/>
+                    </a:stretch>
+                  </pic:blipFill>
+                  <pic:spPr>
+                    <a:xfrm>
+                      <a:off x="0" y="0"/>
+                      <a:ext cx="5486400" cy="3766022"/>
+                    </a:xfrm>
+                    <a:prstGeom prst="rect"/>
+                  </pic:spPr>
+                </pic:pic>
+              </a:graphicData>
+            </a:graphic>
+          </wp:inline>
+        </w:drawing>
+      </w:r>
+    </w:p>
+    <w:p>
+      <w:pPr>
+        <w:jc w:val="center"/>
+      </w:pPr>
+      <w:r>
         <w:rPr>
           <w:i/>
-          <w:color w:val="969696"/>
-          <w:sz w:val="28"/>
+          <w:color w:val="646464"/>
+          <w:sz w:val="18"/>
         </w:rPr>
-        <w:t>[  INSERT SCREENSHOT HERE  ]</w:t>
+        <w:t>Figure 8.3: User Dashboard – Pending Booking Cards</w:t>
       </w:r>
     </w:p>
-    <w:p/>
     <w:p>
       <w:pPr>
         <w:pStyle w:val="Heading3"/>
       </w:pPr>
       <w:r>
-        <w:t>Screenshot 4: Conflict Error (409)</w:t>
+        <w:t>Admin Dashboard – All Pending Bookings</w:t>
       </w:r>
     </w:p>
     <w:p>
       <w:r>
-        <w:t>Demonstrates the alert shown when a user attempts to book a resource that is already booked for an overlapping time slot.</w:t>
+        <w:t>Shows the Admin view listing all bookings across the campus. Each pending booking shows Approve (green) and Reject (red) action buttons.</w:t>
       </w:r>
     </w:p>
     <w:p>
@@ -4357,26 +4479,64 @@
         <w:jc w:val="center"/>
       </w:pPr>
       <w:r>
+        <w:drawing>
+          <wp:inline xmlns:a="http://schemas.openxmlformats.org/drawingml/2006/main" xmlns:pic="http://schemas.openxmlformats.org/drawingml/2006/picture">
+            <wp:extent cx="5486400" cy="3526971"/>
+            <wp:docPr id="4" name="Picture 4"/>
+            <wp:cNvGraphicFramePr>
+              <a:graphicFrameLocks noChangeAspect="1"/>
+            </wp:cNvGraphicFramePr>
+            <a:graphic>
+              <a:graphicData uri="http://schemas.openxmlformats.org/drawingml/2006/picture">
+                <pic:pic>
+                  <pic:nvPicPr>
+                    <pic:cNvPr id="0" name="04_admin_dashboard_pending.png"/>
+                    <pic:cNvPicPr/>
+                  </pic:nvPicPr>
+                  <pic:blipFill>
+                    <a:blip r:embed="rId12"/>
+                    <a:stretch>
+                      <a:fillRect/>
+                    </a:stretch>
+                  </pic:blipFill>
+                  <pic:spPr>
+                    <a:xfrm>
+                      <a:off x="0" y="0"/>
+                      <a:ext cx="5486400" cy="3526971"/>
+                    </a:xfrm>
+                    <a:prstGeom prst="rect"/>
+                  </pic:spPr>
+                </pic:pic>
+              </a:graphicData>
+            </a:graphic>
+          </wp:inline>
+        </w:drawing>
+      </w:r>
+    </w:p>
+    <w:p>
+      <w:pPr>
+        <w:jc w:val="center"/>
+      </w:pPr>
+      <w:r>
         <w:rPr>
           <w:i/>
-          <w:color w:val="969696"/>
-          <w:sz w:val="28"/>
+          <w:color w:val="646464"/>
+          <w:sz w:val="18"/>
         </w:rPr>
-        <w:t>[  INSERT SCREENSHOT HERE  ]</w:t>
+        <w:t>Figure 8.4: Admin Dashboard – All Pending Bookings</w:t>
       </w:r>
     </w:p>
-    <w:p/>
     <w:p>
       <w:pPr>
         <w:pStyle w:val="Heading3"/>
       </w:pPr>
       <w:r>
-        <w:t>Screenshot 5: Rejection with Reason</w:t>
+        <w:t>Admin Dashboard – After Approve/Reject</w:t>
       </w:r>
     </w:p>
     <w:p>
       <w:r>
-        <w:t>Shows the browser prompt requesting a mandatory rejection reason from the admin, and the resulting REJECTED status badge with the reason displayed.</w:t>
+        <w:t>Shows the Admin view after approving and rejecting bookings. Status badges reflect APPROVED (green) and REJECTED (red) states with rejection reason.</w:t>
       </w:r>
     </w:p>
     <w:p>
@@ -4384,26 +4544,64 @@
         <w:jc w:val="center"/>
       </w:pPr>
       <w:r>
+        <w:drawing>
+          <wp:inline xmlns:a="http://schemas.openxmlformats.org/drawingml/2006/main" xmlns:pic="http://schemas.openxmlformats.org/drawingml/2006/picture">
+            <wp:extent cx="5486400" cy="3526971"/>
+            <wp:docPr id="5" name="Picture 5"/>
+            <wp:cNvGraphicFramePr>
+              <a:graphicFrameLocks noChangeAspect="1"/>
+            </wp:cNvGraphicFramePr>
+            <a:graphic>
+              <a:graphicData uri="http://schemas.openxmlformats.org/drawingml/2006/picture">
+                <pic:pic>
+                  <pic:nvPicPr>
+                    <pic:cNvPr id="0" name="05_admin_approved_rejected.png"/>
+                    <pic:cNvPicPr/>
+                  </pic:nvPicPr>
+                  <pic:blipFill>
+                    <a:blip r:embed="rId13"/>
+                    <a:stretch>
+                      <a:fillRect/>
+                    </a:stretch>
+                  </pic:blipFill>
+                  <pic:spPr>
+                    <a:xfrm>
+                      <a:off x="0" y="0"/>
+                      <a:ext cx="5486400" cy="3526971"/>
+                    </a:xfrm>
+                    <a:prstGeom prst="rect"/>
+                  </pic:spPr>
+                </pic:pic>
+              </a:graphicData>
+            </a:graphic>
+          </wp:inline>
+        </w:drawing>
+      </w:r>
+    </w:p>
+    <w:p>
+      <w:pPr>
+        <w:jc w:val="center"/>
+      </w:pPr>
+      <w:r>
         <w:rPr>
           <w:i/>
-          <w:color w:val="969696"/>
-          <w:sz w:val="28"/>
+          <w:color w:val="646464"/>
+          <w:sz w:val="18"/>
         </w:rPr>
-        <w:t>[  INSERT SCREENSHOT HERE  ]</w:t>
+        <w:t>Figure 8.5: Admin Dashboard – After Approve/Reject Actions</w:t>
       </w:r>
     </w:p>
-    <w:p/>
     <w:p>
       <w:pPr>
         <w:pStyle w:val="Heading3"/>
       </w:pPr>
       <w:r>
-        <w:t>Screenshot 6: Test Results (Terminal)</w:t>
+        <w:t>User View – Mixed Booking Statuses</w:t>
       </w:r>
     </w:p>
     <w:p>
       <w:r>
-        <w:t>Maven test output showing all 19 tests passing: Tests run: 19, Failures: 0, Errors: 0, BUILD SUCCESS.</w:t>
+        <w:t>User view showing bookings with mixed statuses: APPROVED (green), REJECTED (red with reason), and PENDING (yellow).</w:t>
       </w:r>
     </w:p>
     <w:p>
@@ -4411,69 +4609,726 @@
         <w:jc w:val="center"/>
       </w:pPr>
       <w:r>
+        <w:drawing>
+          <wp:inline xmlns:a="http://schemas.openxmlformats.org/drawingml/2006/main" xmlns:pic="http://schemas.openxmlformats.org/drawingml/2006/picture">
+            <wp:extent cx="5486400" cy="3766022"/>
+            <wp:docPr id="6" name="Picture 6"/>
+            <wp:cNvGraphicFramePr>
+              <a:graphicFrameLocks noChangeAspect="1"/>
+            </wp:cNvGraphicFramePr>
+            <a:graphic>
+              <a:graphicData uri="http://schemas.openxmlformats.org/drawingml/2006/picture">
+                <pic:pic>
+                  <pic:nvPicPr>
+                    <pic:cNvPr id="0" name="06_user_mixed_statuses.png"/>
+                    <pic:cNvPicPr/>
+                  </pic:nvPicPr>
+                  <pic:blipFill>
+                    <a:blip r:embed="rId14"/>
+                    <a:stretch>
+                      <a:fillRect/>
+                    </a:stretch>
+                  </pic:blipFill>
+                  <pic:spPr>
+                    <a:xfrm>
+                      <a:off x="0" y="0"/>
+                      <a:ext cx="5486400" cy="3766022"/>
+                    </a:xfrm>
+                    <a:prstGeom prst="rect"/>
+                  </pic:spPr>
+                </pic:pic>
+              </a:graphicData>
+            </a:graphic>
+          </wp:inline>
+        </w:drawing>
+      </w:r>
+    </w:p>
+    <w:p>
+      <w:pPr>
+        <w:jc w:val="center"/>
+      </w:pPr>
+      <w:r>
         <w:rPr>
           <w:i/>
-          <w:color w:val="969696"/>
-          <w:sz w:val="28"/>
+          <w:color w:val="646464"/>
+          <w:sz w:val="18"/>
         </w:rPr>
-        <w:t>[  INSERT SCREENSHOT HERE  ]</w:t>
-      </w:r>
-    </w:p>
-    <w:p/>
-    <w:p>
-      <w:pPr>
-        <w:pStyle w:val="Heading3"/>
-      </w:pPr>
-      <w:r>
-        <w:t>Screenshot 7: H2 Console – Database</w:t>
+        <w:t>Figure 8.6: User View – Mixed Booking Statuses</w:t>
       </w:r>
     </w:p>
     <w:p>
       <w:r>
-        <w:t>H2 console (localhost:8080/h2-console) showing the bookings, resources, and users tables with seeded data.</w:t>
+        <w:br w:type="page"/>
       </w:r>
     </w:p>
     <w:p>
       <w:pPr>
-        <w:jc w:val="center"/>
+        <w:pStyle w:val="Heading2"/>
       </w:pPr>
       <w:r>
-        <w:rPr>
-          <w:i/>
-          <w:color w:val="969696"/>
-          <w:sz w:val="28"/>
-        </w:rPr>
-        <w:t>[  INSERT SCREENSHOT HERE  ]</w:t>
-      </w:r>
-    </w:p>
-    <w:p/>
-    <w:p>
-      <w:pPr>
-        <w:pStyle w:val="Heading3"/>
-      </w:pPr>
-      <w:r>
-        <w:t>Screenshot 8: GitHub Repository</w:t>
+        <w:t>8.2 API Testing (Terminal Outputs)</w:t>
       </w:r>
     </w:p>
     <w:p>
       <w:r>
-        <w:t>GitHub repository page showing the commit history, branch, and CI pipeline status.</w:t>
+        <w:t>The following screenshots show REST API testing performed via terminal commands. Each screenshot demonstrates the HTTP request, response status, and JSON response body.</w:t>
       </w:r>
     </w:p>
     <w:p>
       <w:pPr>
+        <w:pStyle w:val="Heading3"/>
+      </w:pPr>
+      <w:r>
+        <w:t>GET All Resources</w:t>
+      </w:r>
+    </w:p>
+    <w:p>
+      <w:r>
+        <w:t>Retrieves all available campus resources (200 OK).</w:t>
+      </w:r>
+    </w:p>
+    <w:p>
+      <w:pPr>
+        <w:jc w:val="center"/>
+      </w:pPr>
+      <w:r>
+        <w:drawing>
+          <wp:inline xmlns:a="http://schemas.openxmlformats.org/drawingml/2006/main" xmlns:pic="http://schemas.openxmlformats.org/drawingml/2006/picture">
+            <wp:extent cx="5486400" cy="4114800"/>
+            <wp:docPr id="7" name="Picture 7"/>
+            <wp:cNvGraphicFramePr>
+              <a:graphicFrameLocks noChangeAspect="1"/>
+            </wp:cNvGraphicFramePr>
+            <a:graphic>
+              <a:graphicData uri="http://schemas.openxmlformats.org/drawingml/2006/picture">
+                <pic:pic>
+                  <pic:nvPicPr>
+                    <pic:cNvPr id="0" name="07_api_get_resources.png"/>
+                    <pic:cNvPicPr/>
+                  </pic:nvPicPr>
+                  <pic:blipFill>
+                    <a:blip r:embed="rId15"/>
+                    <a:stretch>
+                      <a:fillRect/>
+                    </a:stretch>
+                  </pic:blipFill>
+                  <pic:spPr>
+                    <a:xfrm>
+                      <a:off x="0" y="0"/>
+                      <a:ext cx="5486400" cy="4114800"/>
+                    </a:xfrm>
+                    <a:prstGeom prst="rect"/>
+                  </pic:spPr>
+                </pic:pic>
+              </a:graphicData>
+            </a:graphic>
+          </wp:inline>
+        </w:drawing>
+      </w:r>
+    </w:p>
+    <w:p>
+      <w:pPr>
         <w:jc w:val="center"/>
       </w:pPr>
       <w:r>
         <w:rPr>
           <w:i/>
-          <w:color w:val="969696"/>
-          <w:sz w:val="28"/>
+          <w:color w:val="646464"/>
+          <w:sz w:val="18"/>
         </w:rPr>
-        <w:t>[  INSERT SCREENSHOT HERE  ]</w:t>
+        <w:t>Figure 8.7: GET /api/resources – 200 OK</w:t>
       </w:r>
     </w:p>
-    <w:p/>
+    <w:p>
+      <w:pPr>
+        <w:pStyle w:val="Heading3"/>
+      </w:pPr>
+      <w:r>
+        <w:t>POST Create Booking (201 Created)</w:t>
+      </w:r>
+    </w:p>
+    <w:p>
+      <w:r>
+        <w:t>Successfully creates a new booking request with valid data.</w:t>
+      </w:r>
+    </w:p>
+    <w:p>
+      <w:pPr>
+        <w:jc w:val="center"/>
+      </w:pPr>
+      <w:r>
+        <w:drawing>
+          <wp:inline xmlns:a="http://schemas.openxmlformats.org/drawingml/2006/main" xmlns:pic="http://schemas.openxmlformats.org/drawingml/2006/picture">
+            <wp:extent cx="5486400" cy="3990109"/>
+            <wp:docPr id="8" name="Picture 8"/>
+            <wp:cNvGraphicFramePr>
+              <a:graphicFrameLocks noChangeAspect="1"/>
+            </wp:cNvGraphicFramePr>
+            <a:graphic>
+              <a:graphicData uri="http://schemas.openxmlformats.org/drawingml/2006/picture">
+                <pic:pic>
+                  <pic:nvPicPr>
+                    <pic:cNvPr id="0" name="08_api_post_create.png"/>
+                    <pic:cNvPicPr/>
+                  </pic:nvPicPr>
+                  <pic:blipFill>
+                    <a:blip r:embed="rId16"/>
+                    <a:stretch>
+                      <a:fillRect/>
+                    </a:stretch>
+                  </pic:blipFill>
+                  <pic:spPr>
+                    <a:xfrm>
+                      <a:off x="0" y="0"/>
+                      <a:ext cx="5486400" cy="3990109"/>
+                    </a:xfrm>
+                    <a:prstGeom prst="rect"/>
+                  </pic:spPr>
+                </pic:pic>
+              </a:graphicData>
+            </a:graphic>
+          </wp:inline>
+        </w:drawing>
+      </w:r>
+    </w:p>
+    <w:p>
+      <w:pPr>
+        <w:jc w:val="center"/>
+      </w:pPr>
+      <w:r>
+        <w:rPr>
+          <w:i/>
+          <w:color w:val="646464"/>
+          <w:sz w:val="18"/>
+        </w:rPr>
+        <w:t>Figure 8.8: POST /api/bookings – 201 Created</w:t>
+      </w:r>
+    </w:p>
+    <w:p>
+      <w:pPr>
+        <w:pStyle w:val="Heading3"/>
+      </w:pPr>
+      <w:r>
+        <w:t>GET User Bookings</w:t>
+      </w:r>
+    </w:p>
+    <w:p>
+      <w:r>
+        <w:t>Retrieves all bookings for a specific user by ID (200 OK).</w:t>
+      </w:r>
+    </w:p>
+    <w:p>
+      <w:pPr>
+        <w:jc w:val="center"/>
+      </w:pPr>
+      <w:r>
+        <w:drawing>
+          <wp:inline xmlns:a="http://schemas.openxmlformats.org/drawingml/2006/main" xmlns:pic="http://schemas.openxmlformats.org/drawingml/2006/picture">
+            <wp:extent cx="5486400" cy="6059978"/>
+            <wp:docPr id="9" name="Picture 9"/>
+            <wp:cNvGraphicFramePr>
+              <a:graphicFrameLocks noChangeAspect="1"/>
+            </wp:cNvGraphicFramePr>
+            <a:graphic>
+              <a:graphicData uri="http://schemas.openxmlformats.org/drawingml/2006/picture">
+                <pic:pic>
+                  <pic:nvPicPr>
+                    <pic:cNvPr id="0" name="09_api_get_user_bookings.png"/>
+                    <pic:cNvPicPr/>
+                  </pic:nvPicPr>
+                  <pic:blipFill>
+                    <a:blip r:embed="rId17"/>
+                    <a:stretch>
+                      <a:fillRect/>
+                    </a:stretch>
+                  </pic:blipFill>
+                  <pic:spPr>
+                    <a:xfrm>
+                      <a:off x="0" y="0"/>
+                      <a:ext cx="5486400" cy="6059978"/>
+                    </a:xfrm>
+                    <a:prstGeom prst="rect"/>
+                  </pic:spPr>
+                </pic:pic>
+              </a:graphicData>
+            </a:graphic>
+          </wp:inline>
+        </w:drawing>
+      </w:r>
+    </w:p>
+    <w:p>
+      <w:pPr>
+        <w:jc w:val="center"/>
+      </w:pPr>
+      <w:r>
+        <w:rPr>
+          <w:i/>
+          <w:color w:val="646464"/>
+          <w:sz w:val="18"/>
+        </w:rPr>
+        <w:t>Figure 8.9: GET /api/bookings/user/1 – 200 OK</w:t>
+      </w:r>
+    </w:p>
+    <w:p>
+      <w:pPr>
+        <w:pStyle w:val="Heading3"/>
+      </w:pPr>
+      <w:r>
+        <w:t>GET All Bookings (Admin)</w:t>
+      </w:r>
+    </w:p>
+    <w:p>
+      <w:r>
+        <w:t>Admin endpoint retrieves all bookings across the system (200 OK).</w:t>
+      </w:r>
+    </w:p>
+    <w:p>
+      <w:pPr>
+        <w:jc w:val="center"/>
+      </w:pPr>
+      <w:r>
+        <w:drawing>
+          <wp:inline xmlns:a="http://schemas.openxmlformats.org/drawingml/2006/main" xmlns:pic="http://schemas.openxmlformats.org/drawingml/2006/picture">
+            <wp:extent cx="5486400" cy="6059978"/>
+            <wp:docPr id="10" name="Picture 10"/>
+            <wp:cNvGraphicFramePr>
+              <a:graphicFrameLocks noChangeAspect="1"/>
+            </wp:cNvGraphicFramePr>
+            <a:graphic>
+              <a:graphicData uri="http://schemas.openxmlformats.org/drawingml/2006/picture">
+                <pic:pic>
+                  <pic:nvPicPr>
+                    <pic:cNvPr id="0" name="10_api_get_all_bookings.png"/>
+                    <pic:cNvPicPr/>
+                  </pic:nvPicPr>
+                  <pic:blipFill>
+                    <a:blip r:embed="rId18"/>
+                    <a:stretch>
+                      <a:fillRect/>
+                    </a:stretch>
+                  </pic:blipFill>
+                  <pic:spPr>
+                    <a:xfrm>
+                      <a:off x="0" y="0"/>
+                      <a:ext cx="5486400" cy="6059978"/>
+                    </a:xfrm>
+                    <a:prstGeom prst="rect"/>
+                  </pic:spPr>
+                </pic:pic>
+              </a:graphicData>
+            </a:graphic>
+          </wp:inline>
+        </w:drawing>
+      </w:r>
+    </w:p>
+    <w:p>
+      <w:pPr>
+        <w:jc w:val="center"/>
+      </w:pPr>
+      <w:r>
+        <w:rPr>
+          <w:i/>
+          <w:color w:val="646464"/>
+          <w:sz w:val="18"/>
+        </w:rPr>
+        <w:t>Figure 8.10: GET /api/bookings/all – 200 OK</w:t>
+      </w:r>
+    </w:p>
+    <w:p>
+      <w:pPr>
+        <w:pStyle w:val="Heading3"/>
+      </w:pPr>
+      <w:r>
+        <w:t>PATCH Approve Booking</w:t>
+      </w:r>
+    </w:p>
+    <w:p>
+      <w:r>
+        <w:t>Admin approves a pending booking request (200 OK).</w:t>
+      </w:r>
+    </w:p>
+    <w:p>
+      <w:pPr>
+        <w:jc w:val="center"/>
+      </w:pPr>
+      <w:r>
+        <w:drawing>
+          <wp:inline xmlns:a="http://schemas.openxmlformats.org/drawingml/2006/main" xmlns:pic="http://schemas.openxmlformats.org/drawingml/2006/picture">
+            <wp:extent cx="5486400" cy="3990109"/>
+            <wp:docPr id="11" name="Picture 11"/>
+            <wp:cNvGraphicFramePr>
+              <a:graphicFrameLocks noChangeAspect="1"/>
+            </wp:cNvGraphicFramePr>
+            <a:graphic>
+              <a:graphicData uri="http://schemas.openxmlformats.org/drawingml/2006/picture">
+                <pic:pic>
+                  <pic:nvPicPr>
+                    <pic:cNvPr id="0" name="11_api_patch_approve.png"/>
+                    <pic:cNvPicPr/>
+                  </pic:nvPicPr>
+                  <pic:blipFill>
+                    <a:blip r:embed="rId19"/>
+                    <a:stretch>
+                      <a:fillRect/>
+                    </a:stretch>
+                  </pic:blipFill>
+                  <pic:spPr>
+                    <a:xfrm>
+                      <a:off x="0" y="0"/>
+                      <a:ext cx="5486400" cy="3990109"/>
+                    </a:xfrm>
+                    <a:prstGeom prst="rect"/>
+                  </pic:spPr>
+                </pic:pic>
+              </a:graphicData>
+            </a:graphic>
+          </wp:inline>
+        </w:drawing>
+      </w:r>
+    </w:p>
+    <w:p>
+      <w:pPr>
+        <w:jc w:val="center"/>
+      </w:pPr>
+      <w:r>
+        <w:rPr>
+          <w:i/>
+          <w:color w:val="646464"/>
+          <w:sz w:val="18"/>
+        </w:rPr>
+        <w:t>Figure 8.11: PATCH /api/bookings/{id}/status – Approve – 200 OK</w:t>
+      </w:r>
+    </w:p>
+    <w:p>
+      <w:pPr>
+        <w:pStyle w:val="Heading3"/>
+      </w:pPr>
+      <w:r>
+        <w:t>POST Conflict Detection (409)</w:t>
+      </w:r>
+    </w:p>
+    <w:p>
+      <w:r>
+        <w:t>Demonstrates the 409 Conflict response when attempting to book a resource that has an overlapping approved/pending booking for the same time slot.</w:t>
+      </w:r>
+    </w:p>
+    <w:p>
+      <w:pPr>
+        <w:jc w:val="center"/>
+      </w:pPr>
+      <w:r>
+        <w:drawing>
+          <wp:inline xmlns:a="http://schemas.openxmlformats.org/drawingml/2006/main" xmlns:pic="http://schemas.openxmlformats.org/drawingml/2006/picture">
+            <wp:extent cx="5486400" cy="3990109"/>
+            <wp:docPr id="12" name="Picture 12"/>
+            <wp:cNvGraphicFramePr>
+              <a:graphicFrameLocks noChangeAspect="1"/>
+            </wp:cNvGraphicFramePr>
+            <a:graphic>
+              <a:graphicData uri="http://schemas.openxmlformats.org/drawingml/2006/picture">
+                <pic:pic>
+                  <pic:nvPicPr>
+                    <pic:cNvPr id="0" name="12_api_conflict_409.png"/>
+                    <pic:cNvPicPr/>
+                  </pic:nvPicPr>
+                  <pic:blipFill>
+                    <a:blip r:embed="rId20"/>
+                    <a:stretch>
+                      <a:fillRect/>
+                    </a:stretch>
+                  </pic:blipFill>
+                  <pic:spPr>
+                    <a:xfrm>
+                      <a:off x="0" y="0"/>
+                      <a:ext cx="5486400" cy="3990109"/>
+                    </a:xfrm>
+                    <a:prstGeom prst="rect"/>
+                  </pic:spPr>
+                </pic:pic>
+              </a:graphicData>
+            </a:graphic>
+          </wp:inline>
+        </w:drawing>
+      </w:r>
+    </w:p>
+    <w:p>
+      <w:pPr>
+        <w:jc w:val="center"/>
+      </w:pPr>
+      <w:r>
+        <w:rPr>
+          <w:i/>
+          <w:color w:val="646464"/>
+          <w:sz w:val="18"/>
+        </w:rPr>
+        <w:t>Figure 8.12: POST /api/bookings – 409 Conflict</w:t>
+      </w:r>
+    </w:p>
+    <w:p>
+      <w:pPr>
+        <w:pStyle w:val="Heading3"/>
+      </w:pPr>
+      <w:r>
+        <w:t>POST Validation Error (400)</w:t>
+      </w:r>
+    </w:p>
+    <w:p>
+      <w:r>
+        <w:t>Demonstrates the 400 Bad Request response for invalid/missing booking data.</w:t>
+      </w:r>
+    </w:p>
+    <w:p>
+      <w:pPr>
+        <w:jc w:val="center"/>
+      </w:pPr>
+      <w:r>
+        <w:drawing>
+          <wp:inline xmlns:a="http://schemas.openxmlformats.org/drawingml/2006/main" xmlns:pic="http://schemas.openxmlformats.org/drawingml/2006/picture">
+            <wp:extent cx="5486400" cy="3990109"/>
+            <wp:docPr id="13" name="Picture 13"/>
+            <wp:cNvGraphicFramePr>
+              <a:graphicFrameLocks noChangeAspect="1"/>
+            </wp:cNvGraphicFramePr>
+            <a:graphic>
+              <a:graphicData uri="http://schemas.openxmlformats.org/drawingml/2006/picture">
+                <pic:pic>
+                  <pic:nvPicPr>
+                    <pic:cNvPr id="0" name="13_api_validation_400.png"/>
+                    <pic:cNvPicPr/>
+                  </pic:nvPicPr>
+                  <pic:blipFill>
+                    <a:blip r:embed="rId21"/>
+                    <a:stretch>
+                      <a:fillRect/>
+                    </a:stretch>
+                  </pic:blipFill>
+                  <pic:spPr>
+                    <a:xfrm>
+                      <a:off x="0" y="0"/>
+                      <a:ext cx="5486400" cy="3990109"/>
+                    </a:xfrm>
+                    <a:prstGeom prst="rect"/>
+                  </pic:spPr>
+                </pic:pic>
+              </a:graphicData>
+            </a:graphic>
+          </wp:inline>
+        </w:drawing>
+      </w:r>
+    </w:p>
+    <w:p>
+      <w:pPr>
+        <w:jc w:val="center"/>
+      </w:pPr>
+      <w:r>
+        <w:rPr>
+          <w:i/>
+          <w:color w:val="646464"/>
+          <w:sz w:val="18"/>
+        </w:rPr>
+        <w:t>Figure 8.13: POST /api/bookings – 400 Bad Request</w:t>
+      </w:r>
+    </w:p>
+    <w:p>
+      <w:pPr>
+        <w:pStyle w:val="Heading3"/>
+      </w:pPr>
+      <w:r>
+        <w:t>DELETE Cancel Booking (204)</w:t>
+      </w:r>
+    </w:p>
+    <w:p>
+      <w:r>
+        <w:t>User cancels an existing booking (204 No Content).</w:t>
+      </w:r>
+    </w:p>
+    <w:p>
+      <w:pPr>
+        <w:jc w:val="center"/>
+      </w:pPr>
+      <w:r>
+        <w:drawing>
+          <wp:inline xmlns:a="http://schemas.openxmlformats.org/drawingml/2006/main" xmlns:pic="http://schemas.openxmlformats.org/drawingml/2006/picture">
+            <wp:extent cx="5486400" cy="3990109"/>
+            <wp:docPr id="14" name="Picture 14"/>
+            <wp:cNvGraphicFramePr>
+              <a:graphicFrameLocks noChangeAspect="1"/>
+            </wp:cNvGraphicFramePr>
+            <a:graphic>
+              <a:graphicData uri="http://schemas.openxmlformats.org/drawingml/2006/picture">
+                <pic:pic>
+                  <pic:nvPicPr>
+                    <pic:cNvPr id="0" name="14_api_delete_cancel.png"/>
+                    <pic:cNvPicPr/>
+                  </pic:nvPicPr>
+                  <pic:blipFill>
+                    <a:blip r:embed="rId22"/>
+                    <a:stretch>
+                      <a:fillRect/>
+                    </a:stretch>
+                  </pic:blipFill>
+                  <pic:spPr>
+                    <a:xfrm>
+                      <a:off x="0" y="0"/>
+                      <a:ext cx="5486400" cy="3990109"/>
+                    </a:xfrm>
+                    <a:prstGeom prst="rect"/>
+                  </pic:spPr>
+                </pic:pic>
+              </a:graphicData>
+            </a:graphic>
+          </wp:inline>
+        </w:drawing>
+      </w:r>
+    </w:p>
+    <w:p>
+      <w:pPr>
+        <w:jc w:val="center"/>
+      </w:pPr>
+      <w:r>
+        <w:rPr>
+          <w:i/>
+          <w:color w:val="646464"/>
+          <w:sz w:val="18"/>
+        </w:rPr>
+        <w:t>Figure 8.14: DELETE /api/bookings/{id} – 204 No Content</w:t>
+      </w:r>
+    </w:p>
+    <w:p>
+      <w:r>
+        <w:br w:type="page"/>
+      </w:r>
+    </w:p>
+    <w:p>
+      <w:pPr>
+        <w:pStyle w:val="Heading2"/>
+      </w:pPr>
+      <w:r>
+        <w:t>8.3 Automated Test Results</w:t>
+      </w:r>
+    </w:p>
+    <w:p>
+      <w:r>
+        <w:t>Maven test execution output showing all 19 unit tests passing successfully (13 service tests + 6 controller tests). Tests cover CRUD operations, conflict detection, approval workflow, and error handling.</w:t>
+      </w:r>
+    </w:p>
+    <w:p>
+      <w:pPr>
+        <w:jc w:val="center"/>
+      </w:pPr>
+      <w:r>
+        <w:drawing>
+          <wp:inline xmlns:a="http://schemas.openxmlformats.org/drawingml/2006/main" xmlns:pic="http://schemas.openxmlformats.org/drawingml/2006/picture">
+            <wp:extent cx="5486400" cy="5850497"/>
+            <wp:docPr id="15" name="Picture 15"/>
+            <wp:cNvGraphicFramePr>
+              <a:graphicFrameLocks noChangeAspect="1"/>
+            </wp:cNvGraphicFramePr>
+            <a:graphic>
+              <a:graphicData uri="http://schemas.openxmlformats.org/drawingml/2006/picture">
+                <pic:pic>
+                  <pic:nvPicPr>
+                    <pic:cNvPr id="0" name="15_test_results.png"/>
+                    <pic:cNvPicPr/>
+                  </pic:nvPicPr>
+                  <pic:blipFill>
+                    <a:blip r:embed="rId23"/>
+                    <a:stretch>
+                      <a:fillRect/>
+                    </a:stretch>
+                  </pic:blipFill>
+                  <pic:spPr>
+                    <a:xfrm>
+                      <a:off x="0" y="0"/>
+                      <a:ext cx="5486400" cy="5850497"/>
+                    </a:xfrm>
+                    <a:prstGeom prst="rect"/>
+                  </pic:spPr>
+                </pic:pic>
+              </a:graphicData>
+            </a:graphic>
+          </wp:inline>
+        </w:drawing>
+      </w:r>
+    </w:p>
+    <w:p>
+      <w:pPr>
+        <w:jc w:val="center"/>
+      </w:pPr>
+      <w:r>
+        <w:rPr>
+          <w:i/>
+          <w:color w:val="646464"/>
+          <w:sz w:val="18"/>
+        </w:rPr>
+        <w:t>Figure 8.15: Maven Test Results – 19 Tests Passed, BUILD SUCCESS</w:t>
+      </w:r>
+    </w:p>
+    <w:p>
+      <w:pPr>
+        <w:pStyle w:val="Heading2"/>
+      </w:pPr>
+      <w:r>
+        <w:t>8.4 Version Control &amp; GitHub</w:t>
+      </w:r>
+    </w:p>
+    <w:p>
+      <w:r>
+        <w:t>Git commit history showing structured conventional commits and the remote GitHub repository configuration.</w:t>
+      </w:r>
+    </w:p>
+    <w:p>
+      <w:pPr>
+        <w:jc w:val="center"/>
+      </w:pPr>
+      <w:r>
+        <w:drawing>
+          <wp:inline xmlns:a="http://schemas.openxmlformats.org/drawingml/2006/main" xmlns:pic="http://schemas.openxmlformats.org/drawingml/2006/picture">
+            <wp:extent cx="5486400" cy="2992582"/>
+            <wp:docPr id="16" name="Picture 16"/>
+            <wp:cNvGraphicFramePr>
+              <a:graphicFrameLocks noChangeAspect="1"/>
+            </wp:cNvGraphicFramePr>
+            <a:graphic>
+              <a:graphicData uri="http://schemas.openxmlformats.org/drawingml/2006/picture">
+                <pic:pic>
+                  <pic:nvPicPr>
+                    <pic:cNvPr id="0" name="16_git_history.png"/>
+                    <pic:cNvPicPr/>
+                  </pic:nvPicPr>
+                  <pic:blipFill>
+                    <a:blip r:embed="rId24"/>
+                    <a:stretch>
+                      <a:fillRect/>
+                    </a:stretch>
+                  </pic:blipFill>
+                  <pic:spPr>
+                    <a:xfrm>
+                      <a:off x="0" y="0"/>
+                      <a:ext cx="5486400" cy="2992582"/>
+                    </a:xfrm>
+                    <a:prstGeom prst="rect"/>
+                  </pic:spPr>
+                </pic:pic>
+              </a:graphicData>
+            </a:graphic>
+          </wp:inline>
+        </w:drawing>
+      </w:r>
+    </w:p>
+    <w:p>
+      <w:pPr>
+        <w:jc w:val="center"/>
+      </w:pPr>
+      <w:r>
+        <w:rPr>
+          <w:i/>
+          <w:color w:val="646464"/>
+          <w:sz w:val="18"/>
+        </w:rPr>
+        <w:t>Figure 8.16: Git Commit History &amp; GitHub Remote</w:t>
+      </w:r>
+    </w:p>
     <w:p>
       <w:r>
         <w:br w:type="page"/>

</xml_diff>